<commit_message>
refactor: restructure NotebookMH architecture and archive legacy code
- Archive old core, frontend, and utils modules to archive_legacy/
- Add new modular architecture: chat, db, ingest, llm, parsers, rag, studio, vector_store
- Add new UI components: chat_panel, components, sidebar, studio_panel
- Add project plans, roadmaps, and architecture docs
- Update requirements and progress tracking
- Add root .gitignore for Python/cache/temp files
</commit_message>
<xml_diff>
--- a/13-17.docx
+++ b/13-17.docx
@@ -2700,7 +2700,6 @@
           <w:rStyle w:val="8"/>
         </w:rPr>
       </w:pPr>
-      <w:bookmarkStart w:id="0" w:name="_GoBack"/>
       <w:r>
         <w:rPr>
           <w:rStyle w:val="8"/>
@@ -3242,7 +3241,6 @@
         </w:rPr>
       </w:pPr>
     </w:p>
-    <w:bookmarkEnd w:id="0"/>
     <w:p>
       <w:pPr>
         <w:pStyle w:val="3"/>
@@ -4400,6 +4398,7 @@
           <w:rStyle w:val="8"/>
         </w:rPr>
       </w:pPr>
+      <w:bookmarkStart w:id="0" w:name="_GoBack"/>
       <w:r>
         <w:rPr>
           <w:rStyle w:val="8"/>
@@ -4941,9 +4940,17 @@
         <w:rPr>
           <w:rStyle w:val="8"/>
         </w:rPr>
-        <w:t>放弃教科书思维，以硅谷造物主的标准，赋予这堆代码以生命特征。立刻执行！</w:t>
-      </w:r>
-    </w:p>
+        <w:t>放弃教科书思维，以硅谷造物主的标准，</w:t>
+      </w:r>
+      <w:r>
+        <w:rPr>
+          <w:rStyle w:val="8"/>
+          <w:highlight w:val="yellow"/>
+        </w:rPr>
+        <w:t>赋予这堆代码以生命特征。立刻执行！</w:t>
+      </w:r>
+    </w:p>
+    <w:bookmarkEnd w:id="0"/>
     <w:p>
       <w:pPr>
         <w:keepNext w:val="0"/>

</xml_diff>